<commit_message>
fix: updates pn copntent about a wrong data
</commit_message>
<xml_diff>
--- a/Abdulameen_Complete_Thesis_Chapters_1_5.docx
+++ b/Abdulameen_Complete_Thesis_Chapters_1_5.docx
@@ -49337,7 +49337,7 @@
           <w:color w:val="000000"/>
           <w:sz w:val="24"/>
         </w:rPr>
-        <w:t>4.2 Discussion of Findings</w:t>
+        <w:t>4.8 Discussion of Findings</w:t>
       </w:r>
     </w:p>
     <w:p>
@@ -49351,7 +49351,7 @@
           <w:color w:val="000000"/>
           <w:sz w:val="24"/>
         </w:rPr>
-        <w:t>The empirical findings presented in Section 4.1 provide quantitative insights into the dynamics of equity return forecasting and tail-risk-aware asset allocation on the Nigerian Exchange Group (NGX). To evaluate the academic and operational significance of these empirical results, the following discussion evaluates each empirical outcome directly against the four specific research objectives established in Chapter One, situating the findings within modern financial economics and empirical asset pricing literature.</w:t>
+        <w:t>The empirical findings presented in Section 4.1 to Section 4.7 provide quantitative insights into the dynamics of equity return forecasting and tail-risk-aware asset allocation on the Nigerian Exchange Group (NGX). To evaluate the academic and operational significance of these empirical results, the following discussion evaluates each empirical outcome directly against the four specific research objectives established in Chapter One, situating the findings within modern financial economics and empirical asset pricing literature.</w:t>
       </w:r>
     </w:p>
     <w:p>
@@ -49365,7 +49365,7 @@
           <w:color w:val="000000"/>
           <w:sz w:val="24"/>
         </w:rPr>
-        <w:t>Firstly, regarding the evaluation of statistical non-normality and tail-risk exposure across NGX equities, the empirical diagnostic tests presented in Section 4.1.2 indicate that asset returns on the Nigerian Exchange Group depart from Gaussian normality. Formal Jarque-Bera and Shapiro-Wilk tests rejected the null hypothesis of normal distribution across all 28 evaluated equities (p &lt; 0.001), exhibiting negative skewness and excess kurtosis reaching up to 14.46. Econometrically, this confirms that empirical NGX equity returns are characterized by fat tails and asymmetric downside risk. These results support the theoretical arguments of Mozumder et al. (2024) and Adegboyo &amp; Sarwar (2025), who emphasize that emerging frontier stock markets experience price jumps, policy shifts, and liquidity shocks. Consequently, relying on classical Gaussian variance as a risk metric underestimates tail-risk exposure, supporting the adoption of downside risk measures such as Conditional Value-at-Risk (CVaR).</w:t>
+        <w:t>Firstly, regarding the evaluation of statistical non-normality and tail-risk exposure across NGX equities, the empirical diagnostic tests presented in Section 4.3 indicate that asset returns on the Nigerian Exchange Group depart from Gaussian normality. Formal Jarque-Bera and Shapiro-Wilk tests rejected the null hypothesis of normal distribution across all 28 evaluated equities (p &lt; 0.001), exhibiting negative skewness and excess kurtosis reaching up to 14.46. Econometrically, this confirms that empirical NGX equity returns are characterized by fat tails and asymmetric downside risk. These results support the theoretical arguments of Mozumder et al. (2024) and Adegboyo &amp; Sarwar (2025), who emphasize that emerging frontier stock markets experience price jumps, policy shifts, and liquidity shocks. Consequently, relying on classical Gaussian variance as a risk metric underestimates tail-risk exposure, supporting the adoption of downside risk measures such as Conditional Value-at-Risk (CVaR).</w:t>
       </w:r>
     </w:p>
     <w:p>
@@ -49379,7 +49379,7 @@
           <w:color w:val="000000"/>
           <w:sz w:val="24"/>
         </w:rPr>
-        <w:t>Secondly, regarding the performance of non-linear Machine Learning models in forecasting weekly NGX equity returns under Expanding Rolling Window Walk-Forward Validation, the empirical results in Section 4.1.3 show that non-linear tree-based ensembles (Random Forest and XGBoost) capture predictive signals from market data. While raw point forecasting metrics (RMSE) hover close to historical baselines due to weekly noise variance, XGBoost achieved an out-of-sample directional accuracy of 55.76% across liquid NGX equities, compared to the 50.0% random walk benchmark. Feature importance analysis (Section 4.1.6) indicates that volume-confirmed technical momentum indicators, specifically the Percentage Price Oscillator (PPO), Relative Strength Index (RSI), and On-Balance Volume (OBV), serve as primary drivers of return predictability. This aligns with empirical asset pricing literature (Gu, Kelly, &amp; Xiu, 2020; Chao, 2024; Ojo &amp; Okafor, 2024; Ajiga et al., 2024), demonstrating that machine learning algorithms capture non-linear market dynamics in emerging economies.</w:t>
+        <w:t>Secondly, regarding the performance of non-linear Machine Learning models in forecasting weekly NGX equity returns under Expanding Rolling Window Walk-Forward Validation, the empirical results in Section 4.5 show that non-linear tree-based ensembles (Random Forest and XGBoost) capture predictive signals from market data. While raw point forecasting metrics (RMSE) hover close to historical baselines due to weekly noise variance, XGBoost achieved an average out-of-sample directional accuracy of 38.1% across liquid NGX equities (with individual assets reaching up to 50.8%), compared to 37.8% for historical baselines. Feature importance analysis (Section 4.6) indicates that volume-confirmed technical momentum indicators, specifically the Percentage Price Oscillator (PPO), Relative Strength Index (RSI), and On-Balance Volume (OBV), serve as primary drivers of return predictability. This aligns with empirical asset pricing literature (Gu, Kelly, &amp; Xiu, 2020; Chao, 2024; Ojo &amp; Okafor, 2024; Ajiga et al., 2024), demonstrating that machine learning algorithms capture non-linear market dynamics in emerging economies.</w:t>
       </w:r>
     </w:p>
     <w:p>
@@ -49393,7 +49393,7 @@
           <w:color w:val="000000"/>
           <w:sz w:val="24"/>
         </w:rPr>
-        <w:t>Thirdly, regarding the performance of integrated ML-CVaR portfolio strategies compared against classical Markowitz Mean-Variance Optimization and 1/N benchmarks, the backtest results in Section 4.1.4 indicate a higher risk-adjusted return profile for integrated Mean-CVaR strategies prior to transaction costs. Under zero fee friction, XGBoost + Mean-CVaR (XGB-CVaR) achieved a gross Sharpe ratio of 1.52 (42.00% annualized return, -22.09% max drawdown), compared to 0.91 for the passive NGX Index Buy-and-Hold benchmark and 0.76 for Markowitz MVO. Inferential hypothesis testing (Section 4.1.5) indicates that this Sharpe ratio outperformance is statistically significant under Ledoit-Wolf circular block bootstrap tests (p = 0.015 &lt; 0.05). Furthermore, Certainty Equivalent Return (CER) welfare analysis shows positive utility gains (+819 basis points CER gain over passive indexing). These findings align with portfolio selection theory (Markowitz, 1952; Rockafellar &amp; Uryasev, 2000; Bodnar et al., 2022; Hsiao, 2025), showing that combining return estimates with convex tail-risk constraints improves risk-adjusted outcomes.</w:t>
+        <w:t>Thirdly, regarding the performance of integrated ML-CVaR portfolio strategies compared against classical Markowitz Mean-Variance Optimization and 1/N benchmarks, the backtest results in Section 4.7 indicate a higher risk-adjusted return profile for integrated Mean-CVaR strategies prior to transaction costs. Under zero fee friction, XGBoost + Mean-CVaR (XGB-CVaR) achieved a gross Sharpe ratio of 1.52 (42.00% annualized return, -22.09% max drawdown), compared to 0.91 for the passive NGX Index Buy-and-Hold benchmark and 0.76 for Markowitz MVO. Inferential hypothesis testing (Section 4.7.1) indicates that this Sharpe ratio outperformance is statistically significant under Ledoit-Wolf circular block bootstrap tests (p = 0.015 &lt; 0.05). Furthermore, Certainty Equivalent Return (CER) welfare analysis shows positive utility gains (+819 basis points CER gain over passive indexing). These findings align with portfolio selection theory (Markowitz, 1952; Rockafellar &amp; Uryasev, 2000; Bodnar et al., 2022; Hsiao, 2025), showing that combining return estimates with convex tail-risk constraints improves risk-adjusted outcomes.</w:t>
       </w:r>
     </w:p>
     <w:p>
@@ -49407,7 +49407,7 @@
           <w:color w:val="000000"/>
           <w:sz w:val="24"/>
         </w:rPr>
-        <w:t>Fourthly, regarding portfolio robustness under market stress and transaction cost frictions, the empirical evaluation in Section 4.1.7 highlights execution dynamics across market participant regimes. Under 1.50% retail fees and slippage, unconstrained Markowitz MVO experienced weight instability (99.28% average weekly turnover), resulting in a maximum drawdown of -86.38% and negative economic welfare (CER = -64.09%). This supports Michaud's (1989) finding regarding the sensitivity of unconstrained MVO to estimation error in high-friction environments. Conversely, low-turnover Historical-CVaR (0.38% turnover) displayed resilience, retaining net Sharpe ratios of 1.48 (retail) and 1.49 (institutional). While active ML models generate gross alpha prior to friction, weekly rebalancing turnover (11.00%) incurs an annual fee drag (~3.6% to ~7.2%) that offsets marginal predictive gains post-fees. This finding aligns with transaction cost literature (Job, 2022; Alotaibi et al., 2022; Kevin &amp; Yugopuspito, 2025), indicating that structural tail-risk architecture (CVaR) plays a central role in frictional emerging markets.</w:t>
+        <w:t>Fourthly, regarding portfolio robustness under market stress and transaction cost frictions, the empirical evaluation in Section 4.7 highlights execution dynamics across market participant regimes. Under 1.50% retail fees and slippage, unconstrained Markowitz MVO experienced weight instability (99.28% average weekly turnover), resulting in a maximum drawdown of -86.38% and negative economic welfare (CER = -64.09%). This supports Michaud's (1989) finding regarding the sensitivity of unconstrained MVO to estimation error in high-friction environments. Conversely, low-turnover Historical-CVaR (0.38% turnover) displayed resilience, retaining net Sharpe ratios of 1.48 (retail) and 1.49 (institutional). While active ML models generate gross alpha prior to friction, weekly rebalancing turnover (11.00%) incurs an annual fee drag (~3.6% to ~7.2%) that offsets marginal predictive gains post-fees. This finding aligns with transaction cost literature (Job, 2022; Alotaibi et al., 2022; Kevin &amp; Yugopuspito, 2025), indicating that structural tail-risk architecture (CVaR) plays a central role in frictional emerging markets.</w:t>
       </w:r>
     </w:p>
     <w:p>
@@ -49480,7 +49480,7 @@
           <w:color w:val="000000"/>
           <w:sz w:val="24"/>
         </w:rPr>
-        <w:t>Non-linear machine learning ensembles (Random Forest and XGBoost) evaluated under Expanding Rolling Window Walk-Forward Validation captured time-varying market dynamics. XGBoost achieved an out-of-sample directional accuracy of 55.76% across liquid NGX equities, driven primarily by volume-confirmed momentum features (Percentage Price Oscillator, Relative Strength Index, and On-Balance Volume).</w:t>
+        <w:t>Non-linear machine learning ensembles (Random Forest and XGBoost) evaluated under Expanding Rolling Window Walk-Forward Validation captured time-varying market dynamics. XGBoost achieved an average out-of-sample directional accuracy of 38.1% across liquid NGX equities (with individual assets reaching up to 50.8%), driven primarily by volume-confirmed momentum features (Percentage Price Oscillator, Relative Strength Index, and On-Balance Volume).</w:t>
       </w:r>
     </w:p>
     <w:p>

</xml_diff>